<commit_message>
A little fix MathData lab3
</commit_message>
<xml_diff>
--- a/MathData/lab_3_HDFS/lab3.docx
+++ b/MathData/lab_3_HDFS/lab3.docx
@@ -884,15 +884,42 @@
           <w:rFonts w:ascii="Times New Roman" w:hAnsi="Times New Roman" w:cs="Times New Roman"/>
           <w:sz w:val="28"/>
           <w:szCs w:val="28"/>
-        </w:rPr>
-      </w:pPr>
-      <w:r>
-        <w:rPr>
-          <w:rFonts w:ascii="Times New Roman" w:hAnsi="Times New Roman" w:cs="Times New Roman"/>
-          <w:sz w:val="28"/>
-          <w:szCs w:val="28"/>
-        </w:rPr>
-        <w:t>Выполнил команды:</w:t>
+          <w:lang w:val="en-US"/>
+        </w:rPr>
+      </w:pPr>
+      <w:r>
+        <w:rPr>
+          <w:rFonts w:ascii="Times New Roman" w:hAnsi="Times New Roman" w:cs="Times New Roman"/>
+          <w:sz w:val="28"/>
+          <w:szCs w:val="28"/>
+        </w:rPr>
+        <w:t>Выполнил</w:t>
+      </w:r>
+      <w:r>
+        <w:rPr>
+          <w:rFonts w:ascii="Times New Roman" w:hAnsi="Times New Roman" w:cs="Times New Roman"/>
+          <w:sz w:val="28"/>
+          <w:szCs w:val="28"/>
+          <w:lang w:val="en-US"/>
+        </w:rPr>
+        <w:t xml:space="preserve"> </w:t>
+      </w:r>
+      <w:r>
+        <w:rPr>
+          <w:rFonts w:ascii="Times New Roman" w:hAnsi="Times New Roman" w:cs="Times New Roman"/>
+          <w:sz w:val="28"/>
+          <w:szCs w:val="28"/>
+        </w:rPr>
+        <w:t>команды</w:t>
+      </w:r>
+      <w:r>
+        <w:rPr>
+          <w:rFonts w:ascii="Times New Roman" w:hAnsi="Times New Roman" w:cs="Times New Roman"/>
+          <w:sz w:val="28"/>
+          <w:szCs w:val="28"/>
+          <w:lang w:val="en-US"/>
+        </w:rPr>
+        <w:t>:</w:t>
       </w:r>
     </w:p>
     <w:p>
@@ -997,7 +1024,23 @@
           <w:rStyle w:val="VerbatimChar"/>
           <w:lang w:val="en-US"/>
         </w:rPr>
-        <w:t>@node1.mtuci.cloud.ru:lab3_scripts/</w:t>
+        <w:t>@</w:t>
+      </w:r>
+      <w:proofErr w:type="gramStart"/>
+      <w:r>
+        <w:rPr>
+          <w:rStyle w:val="VerbatimChar"/>
+          <w:lang w:val="en-US"/>
+        </w:rPr>
+        <w:t>node1.mtuci.cloud.ru:lab</w:t>
+      </w:r>
+      <w:proofErr w:type="gramEnd"/>
+      <w:r>
+        <w:rPr>
+          <w:rStyle w:val="VerbatimChar"/>
+          <w:lang w:val="en-US"/>
+        </w:rPr>
+        <w:t>3_scripts/</w:t>
       </w:r>
       <w:r>
         <w:rPr>
@@ -1229,6 +1272,7 @@
         <w:t>"</w:t>
       </w:r>
       <w:proofErr w:type="spellStart"/>
+      <w:proofErr w:type="gramStart"/>
       <w:r>
         <w:rPr>
           <w:rFonts w:ascii="Consolas" w:eastAsia="Times New Roman" w:hAnsi="Consolas" w:cs="Times New Roman"/>
@@ -1239,7 +1283,20 @@
           <w:lang w:val="en-US" w:eastAsia="ru-RU"/>
           <w14:ligatures w14:val="none"/>
         </w:rPr>
-        <w:t>aws_access_key_id</w:t>
+        <w:t>aws</w:t>
+      </w:r>
+      <w:proofErr w:type="gramEnd"/>
+      <w:r>
+        <w:rPr>
+          <w:rFonts w:ascii="Consolas" w:eastAsia="Times New Roman" w:hAnsi="Consolas" w:cs="Times New Roman"/>
+          <w:color w:val="A5D6FF"/>
+          <w:kern w:val="0"/>
+          <w:sz w:val="21"/>
+          <w:szCs w:val="21"/>
+          <w:lang w:val="en-US" w:eastAsia="ru-RU"/>
+          <w14:ligatures w14:val="none"/>
+        </w:rPr>
+        <w:t>_access_key_id</w:t>
       </w:r>
       <w:proofErr w:type="spellEnd"/>
       <w:r>
@@ -1380,6 +1437,7 @@
         <w:t>"</w:t>
       </w:r>
       <w:proofErr w:type="spellStart"/>
+      <w:proofErr w:type="gramStart"/>
       <w:r>
         <w:rPr>
           <w:rFonts w:ascii="Consolas" w:eastAsia="Times New Roman" w:hAnsi="Consolas" w:cs="Times New Roman"/>
@@ -1390,7 +1448,20 @@
           <w:lang w:val="en-US" w:eastAsia="ru-RU"/>
           <w14:ligatures w14:val="none"/>
         </w:rPr>
-        <w:t>aws_secret_access_key</w:t>
+        <w:t>aws</w:t>
+      </w:r>
+      <w:proofErr w:type="gramEnd"/>
+      <w:r>
+        <w:rPr>
+          <w:rFonts w:ascii="Consolas" w:eastAsia="Times New Roman" w:hAnsi="Consolas" w:cs="Times New Roman"/>
+          <w:color w:val="A5D6FF"/>
+          <w:kern w:val="0"/>
+          <w:sz w:val="21"/>
+          <w:szCs w:val="21"/>
+          <w:lang w:val="en-US" w:eastAsia="ru-RU"/>
+          <w14:ligatures w14:val="none"/>
+        </w:rPr>
+        <w:t>_secret_access_key</w:t>
       </w:r>
       <w:proofErr w:type="spellEnd"/>
       <w:r>
@@ -1531,6 +1602,7 @@
         <w:t>"</w:t>
       </w:r>
       <w:proofErr w:type="spellStart"/>
+      <w:proofErr w:type="gramStart"/>
       <w:r>
         <w:rPr>
           <w:rFonts w:ascii="Consolas" w:eastAsia="Times New Roman" w:hAnsi="Consolas" w:cs="Times New Roman"/>
@@ -1541,7 +1613,20 @@
           <w:lang w:val="en-US" w:eastAsia="ru-RU"/>
           <w14:ligatures w14:val="none"/>
         </w:rPr>
-        <w:t>aws_session_token</w:t>
+        <w:t>aws</w:t>
+      </w:r>
+      <w:proofErr w:type="gramEnd"/>
+      <w:r>
+        <w:rPr>
+          <w:rFonts w:ascii="Consolas" w:eastAsia="Times New Roman" w:hAnsi="Consolas" w:cs="Times New Roman"/>
+          <w:color w:val="A5D6FF"/>
+          <w:kern w:val="0"/>
+          <w:sz w:val="21"/>
+          <w:szCs w:val="21"/>
+          <w:lang w:val="en-US" w:eastAsia="ru-RU"/>
+          <w14:ligatures w14:val="none"/>
+        </w:rPr>
+        <w:t>_session_token</w:t>
       </w:r>
       <w:proofErr w:type="spellEnd"/>
       <w:r>
@@ -1714,6 +1799,14 @@
           <w:szCs w:val="28"/>
         </w:rPr>
         <w:t xml:space="preserve"> — временный токен, необходимый для аутентификации при использовании временных учётных данных. Вместе они позволяют приложению безопасно обращаться к облачным сервисам и API с учётом выданных прав доступа.</w:t>
+      </w:r>
+      <w:r>
+        <w:rPr>
+          <w:rFonts w:ascii="Times New Roman" w:hAnsi="Times New Roman" w:cs="Times New Roman"/>
+          <w:sz w:val="28"/>
+          <w:szCs w:val="28"/>
+        </w:rPr>
+        <w:t xml:space="preserve"> Временный ключ лучше всего подходит для временного доступа к хранилищу, на нашем примере для выполнения лаб работы. Через 12ч доступ к хранилищу будет неактуален.</w:t>
       </w:r>
     </w:p>
     <w:p>
@@ -2076,9 +2169,9 @@
           <w:lang w:val="en-US"/>
         </w:rPr>
         <w:drawing>
-          <wp:inline distT="0" distB="0" distL="0" distR="0" wp14:anchorId="60BE2E3E" wp14:editId="0A099076">
-            <wp:extent cx="6061830" cy="2905125"/>
-            <wp:effectExtent l="0" t="0" r="0" b="0"/>
+          <wp:inline distT="0" distB="0" distL="0" distR="0" wp14:anchorId="60BE2E3E" wp14:editId="2403600A">
+            <wp:extent cx="5273961" cy="2527540"/>
+            <wp:effectExtent l="0" t="0" r="3175" b="6350"/>
             <wp:docPr id="1666611935" name="Рисунок 1"/>
             <wp:cNvGraphicFramePr>
               <a:graphicFrameLocks xmlns:a="http://schemas.openxmlformats.org/drawingml/2006/main" noChangeAspect="1"/>
@@ -2099,7 +2192,7 @@
                   <pic:spPr>
                     <a:xfrm>
                       <a:off x="0" y="0"/>
-                      <a:ext cx="6083471" cy="2915497"/>
+                      <a:ext cx="5321991" cy="2550558"/>
                     </a:xfrm>
                     <a:prstGeom prst="rect">
                       <a:avLst/>
@@ -3178,7 +3271,39 @@
           <w:sz w:val="28"/>
           <w:szCs w:val="28"/>
         </w:rPr>
-        <w:t xml:space="preserve">Вернул код 404 – не найдено. Т.к. </w:t>
+        <w:t xml:space="preserve">Вернул код </w:t>
+      </w:r>
+      <w:r>
+        <w:rPr>
+          <w:rFonts w:ascii="Times New Roman" w:hAnsi="Times New Roman" w:cs="Times New Roman"/>
+          <w:sz w:val="28"/>
+          <w:szCs w:val="28"/>
+        </w:rPr>
+        <w:t>307</w:t>
+      </w:r>
+      <w:r>
+        <w:rPr>
+          <w:rFonts w:ascii="Times New Roman" w:hAnsi="Times New Roman" w:cs="Times New Roman"/>
+          <w:sz w:val="28"/>
+          <w:szCs w:val="28"/>
+        </w:rPr>
+        <w:t xml:space="preserve"> – </w:t>
+      </w:r>
+      <w:r>
+        <w:rPr>
+          <w:rFonts w:ascii="Times New Roman" w:hAnsi="Times New Roman" w:cs="Times New Roman"/>
+          <w:sz w:val="28"/>
+          <w:szCs w:val="28"/>
+        </w:rPr>
+        <w:t>Временное перенаправление</w:t>
+      </w:r>
+      <w:r>
+        <w:rPr>
+          <w:rFonts w:ascii="Times New Roman" w:hAnsi="Times New Roman" w:cs="Times New Roman"/>
+          <w:sz w:val="28"/>
+          <w:szCs w:val="28"/>
+        </w:rPr>
+        <w:t xml:space="preserve">. Т.к. </w:t>
       </w:r>
       <w:proofErr w:type="spellStart"/>
       <w:r>
@@ -4057,7 +4182,21 @@
         <w:rPr>
           <w:rStyle w:val="VerbatimChar"/>
         </w:rPr>
-        <w:t xml:space="preserve"> $i" &gt; ~/tmp100/part-$i.txt</w:t>
+        <w:t xml:space="preserve"> $i</w:t>
+      </w:r>
+      <w:proofErr w:type="gramStart"/>
+      <w:r>
+        <w:rPr>
+          <w:rStyle w:val="VerbatimChar"/>
+        </w:rPr>
+        <w:t>" &gt;</w:t>
+      </w:r>
+      <w:proofErr w:type="gramEnd"/>
+      <w:r>
+        <w:rPr>
+          <w:rStyle w:val="VerbatimChar"/>
+        </w:rPr>
+        <w:t xml:space="preserve"> ~/tmp100/part-$i.txt</w:t>
       </w:r>
       <w:r>
         <w:br/>
@@ -5356,6 +5495,7 @@
           <w:bCs/>
           <w:sz w:val="28"/>
           <w:szCs w:val="28"/>
+          <w:lang w:val="en-US"/>
         </w:rPr>
       </w:pPr>
       <w:r>
@@ -5365,6 +5505,7 @@
           <w:bCs/>
           <w:sz w:val="28"/>
           <w:szCs w:val="28"/>
+          <w:lang w:val="en-US"/>
         </w:rPr>
         <w:t>2.2</w:t>
       </w:r>
@@ -5376,15 +5517,25 @@
           <w:rFonts w:ascii="Times New Roman" w:hAnsi="Times New Roman" w:cs="Times New Roman"/>
           <w:sz w:val="28"/>
           <w:szCs w:val="28"/>
-        </w:rPr>
-      </w:pPr>
-      <w:r>
-        <w:rPr>
-          <w:rFonts w:ascii="Times New Roman" w:hAnsi="Times New Roman" w:cs="Times New Roman"/>
-          <w:sz w:val="28"/>
-          <w:szCs w:val="28"/>
-        </w:rPr>
-        <w:t xml:space="preserve">Дописал </w:t>
+          <w:lang w:val="en-US"/>
+        </w:rPr>
+      </w:pPr>
+      <w:r>
+        <w:rPr>
+          <w:rFonts w:ascii="Times New Roman" w:hAnsi="Times New Roman" w:cs="Times New Roman"/>
+          <w:sz w:val="28"/>
+          <w:szCs w:val="28"/>
+        </w:rPr>
+        <w:t>Дописал</w:t>
+      </w:r>
+      <w:r>
+        <w:rPr>
+          <w:rFonts w:ascii="Times New Roman" w:hAnsi="Times New Roman" w:cs="Times New Roman"/>
+          <w:sz w:val="28"/>
+          <w:szCs w:val="28"/>
+          <w:lang w:val="en-US"/>
+        </w:rPr>
+        <w:t xml:space="preserve"> </w:t>
       </w:r>
       <w:r>
         <w:rPr>
@@ -5400,6 +5551,7 @@
           <w:rFonts w:ascii="Times New Roman" w:hAnsi="Times New Roman" w:cs="Times New Roman"/>
           <w:sz w:val="28"/>
           <w:szCs w:val="28"/>
+          <w:lang w:val="en-US"/>
         </w:rPr>
         <w:t>:</w:t>
       </w:r>
@@ -5453,7 +5605,20 @@
           <w:lang w:val="en-US" w:eastAsia="ru-RU"/>
           <w14:ligatures w14:val="none"/>
         </w:rPr>
-        <w:t>append_line</w:t>
+        <w:t>append_</w:t>
+      </w:r>
+      <w:proofErr w:type="gramStart"/>
+      <w:r>
+        <w:rPr>
+          <w:rFonts w:ascii="Consolas" w:eastAsia="Times New Roman" w:hAnsi="Consolas" w:cs="Times New Roman"/>
+          <w:color w:val="D2A8FF"/>
+          <w:kern w:val="0"/>
+          <w:sz w:val="21"/>
+          <w:szCs w:val="21"/>
+          <w:lang w:val="en-US" w:eastAsia="ru-RU"/>
+          <w14:ligatures w14:val="none"/>
+        </w:rPr>
+        <w:t>line</w:t>
       </w:r>
       <w:proofErr w:type="spellEnd"/>
       <w:r>
@@ -5468,6 +5633,7 @@
         </w:rPr>
         <w:t>(</w:t>
       </w:r>
+      <w:proofErr w:type="gramEnd"/>
       <w:r>
         <w:rPr>
           <w:rFonts w:ascii="Consolas" w:eastAsia="Times New Roman" w:hAnsi="Consolas" w:cs="Times New Roman"/>
@@ -5882,7 +6048,20 @@
           <w:lang w:val="en-US" w:eastAsia="ru-RU"/>
           <w14:ligatures w14:val="none"/>
         </w:rPr>
-        <w:t>.get_object</w:t>
+        <w:t>.get_</w:t>
+      </w:r>
+      <w:proofErr w:type="gramStart"/>
+      <w:r>
+        <w:rPr>
+          <w:rFonts w:ascii="Consolas" w:eastAsia="Times New Roman" w:hAnsi="Consolas" w:cs="Times New Roman"/>
+          <w:color w:val="BBBEBF"/>
+          <w:kern w:val="0"/>
+          <w:sz w:val="21"/>
+          <w:szCs w:val="21"/>
+          <w:lang w:val="en-US" w:eastAsia="ru-RU"/>
+          <w14:ligatures w14:val="none"/>
+        </w:rPr>
+        <w:t>object</w:t>
       </w:r>
       <w:proofErr w:type="spellEnd"/>
       <w:r>
@@ -5897,6 +6076,7 @@
         </w:rPr>
         <w:t>(</w:t>
       </w:r>
+      <w:proofErr w:type="gramEnd"/>
       <w:r>
         <w:rPr>
           <w:rFonts w:ascii="Consolas" w:eastAsia="Times New Roman" w:hAnsi="Consolas" w:cs="Times New Roman"/>
@@ -6121,17 +6301,31 @@
         </w:rPr>
         <w:t>'Body'</w:t>
       </w:r>
-      <w:r>
-        <w:rPr>
-          <w:rFonts w:ascii="Consolas" w:eastAsia="Times New Roman" w:hAnsi="Consolas" w:cs="Times New Roman"/>
-          <w:color w:val="BBBEBF"/>
-          <w:kern w:val="0"/>
-          <w:sz w:val="21"/>
-          <w:szCs w:val="21"/>
-          <w:lang w:val="en-US" w:eastAsia="ru-RU"/>
-          <w14:ligatures w14:val="none"/>
-        </w:rPr>
-        <w:t>].read()</w:t>
+      <w:proofErr w:type="gramStart"/>
+      <w:r>
+        <w:rPr>
+          <w:rFonts w:ascii="Consolas" w:eastAsia="Times New Roman" w:hAnsi="Consolas" w:cs="Times New Roman"/>
+          <w:color w:val="BBBEBF"/>
+          <w:kern w:val="0"/>
+          <w:sz w:val="21"/>
+          <w:szCs w:val="21"/>
+          <w:lang w:val="en-US" w:eastAsia="ru-RU"/>
+          <w14:ligatures w14:val="none"/>
+        </w:rPr>
+        <w:t>].read</w:t>
+      </w:r>
+      <w:proofErr w:type="gramEnd"/>
+      <w:r>
+        <w:rPr>
+          <w:rFonts w:ascii="Consolas" w:eastAsia="Times New Roman" w:hAnsi="Consolas" w:cs="Times New Roman"/>
+          <w:color w:val="BBBEBF"/>
+          <w:kern w:val="0"/>
+          <w:sz w:val="21"/>
+          <w:szCs w:val="21"/>
+          <w:lang w:val="en-US" w:eastAsia="ru-RU"/>
+          <w14:ligatures w14:val="none"/>
+        </w:rPr>
+        <w:t>()</w:t>
       </w:r>
     </w:p>
     <w:p>
@@ -6160,6 +6354,7 @@
         </w:rPr>
         <w:t xml:space="preserve">        </w:t>
       </w:r>
+      <w:proofErr w:type="gramStart"/>
       <w:r>
         <w:rPr>
           <w:rFonts w:ascii="Consolas" w:eastAsia="Times New Roman" w:hAnsi="Consolas" w:cs="Times New Roman"/>
@@ -6184,6 +6379,7 @@
         </w:rPr>
         <w:t>(</w:t>
       </w:r>
+      <w:proofErr w:type="gramEnd"/>
       <w:r>
         <w:rPr>
           <w:rFonts w:ascii="Consolas" w:eastAsia="Times New Roman" w:hAnsi="Consolas" w:cs="Times New Roman"/>
@@ -6635,7 +6831,20 @@
           <w:lang w:val="en-US" w:eastAsia="ru-RU"/>
           <w14:ligatures w14:val="none"/>
         </w:rPr>
-        <w:t>.put_object</w:t>
+        <w:t>.put_</w:t>
+      </w:r>
+      <w:proofErr w:type="gramStart"/>
+      <w:r>
+        <w:rPr>
+          <w:rFonts w:ascii="Consolas" w:eastAsia="Times New Roman" w:hAnsi="Consolas" w:cs="Times New Roman"/>
+          <w:color w:val="BBBEBF"/>
+          <w:kern w:val="0"/>
+          <w:sz w:val="21"/>
+          <w:szCs w:val="21"/>
+          <w:lang w:val="en-US" w:eastAsia="ru-RU"/>
+          <w14:ligatures w14:val="none"/>
+        </w:rPr>
+        <w:t>object</w:t>
       </w:r>
       <w:proofErr w:type="spellEnd"/>
       <w:r>
@@ -6650,6 +6859,7 @@
         </w:rPr>
         <w:t>(</w:t>
       </w:r>
+      <w:proofErr w:type="gramEnd"/>
       <w:r>
         <w:rPr>
           <w:rFonts w:ascii="Consolas" w:eastAsia="Times New Roman" w:hAnsi="Consolas" w:cs="Times New Roman"/>
@@ -6823,6 +7033,7 @@
         </w:rPr>
         <w:t xml:space="preserve">        </w:t>
       </w:r>
+      <w:proofErr w:type="gramStart"/>
       <w:r>
         <w:rPr>
           <w:rFonts w:ascii="Consolas" w:eastAsia="Times New Roman" w:hAnsi="Consolas" w:cs="Times New Roman"/>
@@ -6847,6 +7058,7 @@
         </w:rPr>
         <w:t>(</w:t>
       </w:r>
+      <w:proofErr w:type="gramEnd"/>
       <w:r>
         <w:rPr>
           <w:rFonts w:ascii="Consolas" w:eastAsia="Times New Roman" w:hAnsi="Consolas" w:cs="Times New Roman"/>
@@ -7682,6 +7894,7 @@
           <w:bCs/>
           <w:sz w:val="28"/>
           <w:szCs w:val="28"/>
+          <w:lang w:val="en-US"/>
         </w:rPr>
       </w:pPr>
       <w:r>
@@ -7691,6 +7904,7 @@
           <w:bCs/>
           <w:sz w:val="28"/>
           <w:szCs w:val="28"/>
+          <w:lang w:val="en-US"/>
         </w:rPr>
         <w:lastRenderedPageBreak/>
         <w:t>2.3</w:t>
@@ -7727,6 +7941,7 @@
           <w:rFonts w:ascii="Times New Roman" w:hAnsi="Times New Roman" w:cs="Times New Roman"/>
           <w:sz w:val="28"/>
           <w:szCs w:val="28"/>
+          <w:lang w:val="en-US"/>
         </w:rPr>
         <w:t xml:space="preserve"> </w:t>
       </w:r>
@@ -7789,7 +8004,20 @@
           <w:lang w:val="en-US" w:eastAsia="ru-RU"/>
           <w14:ligatures w14:val="none"/>
         </w:rPr>
-        <w:t>rename_prefix</w:t>
+        <w:t>rename_</w:t>
+      </w:r>
+      <w:proofErr w:type="gramStart"/>
+      <w:r>
+        <w:rPr>
+          <w:rFonts w:ascii="Consolas" w:eastAsia="Times New Roman" w:hAnsi="Consolas" w:cs="Times New Roman"/>
+          <w:color w:val="D2A8FF"/>
+          <w:kern w:val="0"/>
+          <w:sz w:val="21"/>
+          <w:szCs w:val="21"/>
+          <w:lang w:val="en-US" w:eastAsia="ru-RU"/>
+          <w14:ligatures w14:val="none"/>
+        </w:rPr>
+        <w:t>prefix</w:t>
       </w:r>
       <w:proofErr w:type="spellEnd"/>
       <w:r>
@@ -7805,6 +8033,7 @@
         <w:t>(</w:t>
       </w:r>
       <w:proofErr w:type="spellStart"/>
+      <w:proofErr w:type="gramEnd"/>
       <w:r>
         <w:rPr>
           <w:rFonts w:ascii="Consolas" w:eastAsia="Times New Roman" w:hAnsi="Consolas" w:cs="Times New Roman"/>
@@ -8138,6 +8367,7 @@
         <w:t xml:space="preserve"> на каждый ключ; </w:t>
       </w:r>
       <w:proofErr w:type="spellStart"/>
+      <w:proofErr w:type="gramStart"/>
       <w:r>
         <w:rPr>
           <w:rFonts w:ascii="Consolas" w:eastAsia="Times New Roman" w:hAnsi="Consolas" w:cs="Times New Roman"/>
@@ -8161,7 +8391,20 @@
           <w:lang w:eastAsia="ru-RU"/>
           <w14:ligatures w14:val="none"/>
         </w:rPr>
-        <w:t>() тоже запрос."""</w:t>
+        <w:t>(</w:t>
+      </w:r>
+      <w:proofErr w:type="gramEnd"/>
+      <w:r>
+        <w:rPr>
+          <w:rFonts w:ascii="Consolas" w:eastAsia="Times New Roman" w:hAnsi="Consolas" w:cs="Times New Roman"/>
+          <w:color w:val="A5D6FF"/>
+          <w:kern w:val="0"/>
+          <w:sz w:val="21"/>
+          <w:szCs w:val="21"/>
+          <w:lang w:eastAsia="ru-RU"/>
+          <w14:ligatures w14:val="none"/>
+        </w:rPr>
+        <w:t>) тоже запрос."""</w:t>
       </w:r>
     </w:p>
     <w:p>
@@ -8782,7 +9025,20 @@
           <w:lang w:val="en-US" w:eastAsia="ru-RU"/>
           <w14:ligatures w14:val="none"/>
         </w:rPr>
-        <w:t>.copy_object</w:t>
+        <w:t>.copy_</w:t>
+      </w:r>
+      <w:proofErr w:type="gramStart"/>
+      <w:r>
+        <w:rPr>
+          <w:rFonts w:ascii="Consolas" w:eastAsia="Times New Roman" w:hAnsi="Consolas" w:cs="Times New Roman"/>
+          <w:color w:val="BBBEBF"/>
+          <w:kern w:val="0"/>
+          <w:sz w:val="21"/>
+          <w:szCs w:val="21"/>
+          <w:lang w:val="en-US" w:eastAsia="ru-RU"/>
+          <w14:ligatures w14:val="none"/>
+        </w:rPr>
+        <w:t>object</w:t>
       </w:r>
       <w:proofErr w:type="spellEnd"/>
       <w:r>
@@ -8797,6 +9053,7 @@
         </w:rPr>
         <w:t>(</w:t>
       </w:r>
+      <w:proofErr w:type="gramEnd"/>
     </w:p>
     <w:p>
       <w:pPr>
@@ -8990,6 +9247,7 @@
         <w:t>CopySource</w:t>
       </w:r>
       <w:proofErr w:type="spellEnd"/>
+      <w:proofErr w:type="gramStart"/>
       <w:r>
         <w:rPr>
           <w:rFonts w:ascii="Consolas" w:eastAsia="Times New Roman" w:hAnsi="Consolas" w:cs="Times New Roman"/>
@@ -9014,6 +9272,7 @@
         </w:rPr>
         <w:t>{</w:t>
       </w:r>
+      <w:proofErr w:type="gramEnd"/>
       <w:r>
         <w:rPr>
           <w:rFonts w:ascii="Consolas" w:eastAsia="Times New Roman" w:hAnsi="Consolas" w:cs="Times New Roman"/>
@@ -9276,7 +9535,20 @@
           <w:lang w:val="en-US" w:eastAsia="ru-RU"/>
           <w14:ligatures w14:val="none"/>
         </w:rPr>
-        <w:t>.delete_object</w:t>
+        <w:t>.delete_</w:t>
+      </w:r>
+      <w:proofErr w:type="gramStart"/>
+      <w:r>
+        <w:rPr>
+          <w:rFonts w:ascii="Consolas" w:eastAsia="Times New Roman" w:hAnsi="Consolas" w:cs="Times New Roman"/>
+          <w:color w:val="BBBEBF"/>
+          <w:kern w:val="0"/>
+          <w:sz w:val="21"/>
+          <w:szCs w:val="21"/>
+          <w:lang w:val="en-US" w:eastAsia="ru-RU"/>
+          <w14:ligatures w14:val="none"/>
+        </w:rPr>
+        <w:t>object</w:t>
       </w:r>
       <w:proofErr w:type="spellEnd"/>
       <w:r>
@@ -9291,6 +9563,7 @@
         </w:rPr>
         <w:t>(</w:t>
       </w:r>
+      <w:proofErr w:type="gramEnd"/>
       <w:r>
         <w:rPr>
           <w:rFonts w:ascii="Consolas" w:eastAsia="Times New Roman" w:hAnsi="Consolas" w:cs="Times New Roman"/>
@@ -10066,7 +10339,15 @@
             </w:r>
             <w:proofErr w:type="spellEnd"/>
             <w:r>
-              <w:t xml:space="preserve"> в RAM. Время: миллисекунды – О(1)</w:t>
+              <w:t xml:space="preserve"> в RAM. Время: миллисекунды – </w:t>
+            </w:r>
+            <w:proofErr w:type="gramStart"/>
+            <w:r>
+              <w:t>О(</w:t>
+            </w:r>
+            <w:proofErr w:type="gramEnd"/>
+            <w:r>
+              <w:t>1)</w:t>
             </w:r>
           </w:p>
         </w:tc>
@@ -10860,7 +11141,32 @@
           <w:szCs w:val="28"/>
           <w:lang w:val="en-US"/>
         </w:rPr>
-        <w:t xml:space="preserve">make ops </w:t>
+        <w:t>make</w:t>
+      </w:r>
+      <w:r>
+        <w:rPr>
+          <w:rFonts w:ascii="Times New Roman" w:hAnsi="Times New Roman" w:cs="Times New Roman"/>
+          <w:sz w:val="28"/>
+          <w:szCs w:val="28"/>
+        </w:rPr>
+        <w:t xml:space="preserve"> </w:t>
+      </w:r>
+      <w:r>
+        <w:rPr>
+          <w:rFonts w:ascii="Times New Roman" w:hAnsi="Times New Roman" w:cs="Times New Roman"/>
+          <w:sz w:val="28"/>
+          <w:szCs w:val="28"/>
+          <w:lang w:val="en-US"/>
+        </w:rPr>
+        <w:t>ops</w:t>
+      </w:r>
+      <w:r>
+        <w:rPr>
+          <w:rFonts w:ascii="Times New Roman" w:hAnsi="Times New Roman" w:cs="Times New Roman"/>
+          <w:sz w:val="28"/>
+          <w:szCs w:val="28"/>
+        </w:rPr>
+        <w:t xml:space="preserve"> </w:t>
       </w:r>
       <w:proofErr w:type="spellStart"/>
       <w:r>
@@ -10878,60 +11184,8 @@
           <w:rFonts w:ascii="Times New Roman" w:hAnsi="Times New Roman" w:cs="Times New Roman"/>
           <w:sz w:val="28"/>
           <w:szCs w:val="28"/>
-          <w:lang w:val="en-US"/>
         </w:rPr>
         <w:t>:</w:t>
-      </w:r>
-    </w:p>
-    <w:p>
-      <w:pPr>
-        <w:spacing w:line="240" w:lineRule="auto"/>
-        <w:rPr>
-          <w:rFonts w:ascii="Times New Roman" w:hAnsi="Times New Roman" w:cs="Times New Roman"/>
-          <w:sz w:val="28"/>
-          <w:szCs w:val="28"/>
-          <w:lang w:val="en-US"/>
-        </w:rPr>
-      </w:pPr>
-      <w:r>
-        <w:rPr>
-          <w:noProof/>
-        </w:rPr>
-        <w:drawing>
-          <wp:inline distT="0" distB="0" distL="0" distR="0" wp14:anchorId="668EAC9F" wp14:editId="36D956BC">
-            <wp:extent cx="5940425" cy="543560"/>
-            <wp:effectExtent l="0" t="0" r="3175" b="8890"/>
-            <wp:docPr id="1411616939" name="Рисунок 1"/>
-            <wp:cNvGraphicFramePr>
-              <a:graphicFrameLocks xmlns:a="http://schemas.openxmlformats.org/drawingml/2006/main" noChangeAspect="1"/>
-            </wp:cNvGraphicFramePr>
-            <a:graphic xmlns:a="http://schemas.openxmlformats.org/drawingml/2006/main">
-              <a:graphicData uri="http://schemas.openxmlformats.org/drawingml/2006/picture">
-                <pic:pic xmlns:pic="http://schemas.openxmlformats.org/drawingml/2006/picture">
-                  <pic:nvPicPr>
-                    <pic:cNvPr id="1411616939" name=""/>
-                    <pic:cNvPicPr/>
-                  </pic:nvPicPr>
-                  <pic:blipFill>
-                    <a:blip r:embed="rId23"/>
-                    <a:stretch>
-                      <a:fillRect/>
-                    </a:stretch>
-                  </pic:blipFill>
-                  <pic:spPr>
-                    <a:xfrm>
-                      <a:off x="0" y="0"/>
-                      <a:ext cx="5940425" cy="543560"/>
-                    </a:xfrm>
-                    <a:prstGeom prst="rect">
-                      <a:avLst/>
-                    </a:prstGeom>
-                  </pic:spPr>
-                </pic:pic>
-              </a:graphicData>
-            </a:graphic>
-          </wp:inline>
-        </w:drawing>
       </w:r>
     </w:p>
     <w:p>
@@ -11411,7 +11665,7 @@
                     <pic:cNvPicPr/>
                   </pic:nvPicPr>
                   <pic:blipFill>
-                    <a:blip r:embed="rId24"/>
+                    <a:blip r:embed="rId23"/>
                     <a:stretch>
                       <a:fillRect/>
                     </a:stretch>
@@ -11439,6 +11693,18 @@
           <w:rFonts w:ascii="Times New Roman" w:hAnsi="Times New Roman" w:cs="Times New Roman"/>
           <w:sz w:val="28"/>
           <w:szCs w:val="28"/>
+          <w:lang w:val="en-US"/>
+        </w:rPr>
+      </w:pPr>
+    </w:p>
+    <w:p>
+      <w:pPr>
+        <w:spacing w:line="240" w:lineRule="auto"/>
+        <w:rPr>
+          <w:rFonts w:ascii="Times New Roman" w:hAnsi="Times New Roman" w:cs="Times New Roman"/>
+          <w:sz w:val="28"/>
+          <w:szCs w:val="28"/>
+          <w:lang w:val="en-US"/>
         </w:rPr>
       </w:pPr>
     </w:p>
@@ -12245,7 +12511,7 @@
                     <pic:cNvPicPr/>
                   </pic:nvPicPr>
                   <pic:blipFill>
-                    <a:blip r:embed="rId25">
+                    <a:blip r:embed="rId24">
                       <a:extLst>
                         <a:ext uri="{28A0092B-C50C-407E-A947-70E740481C1C}">
                           <a14:useLocalDpi xmlns:a14="http://schemas.microsoft.com/office/drawing/2010/main" val="0"/>
@@ -12385,6 +12651,7 @@
           <w:bCs/>
           <w:sz w:val="28"/>
           <w:szCs w:val="28"/>
+          <w:lang w:val="en-US"/>
         </w:rPr>
       </w:pPr>
       <w:r>
@@ -12394,6 +12661,7 @@
           <w:bCs/>
           <w:sz w:val="28"/>
           <w:szCs w:val="28"/>
+          <w:lang w:val="en-US"/>
         </w:rPr>
         <w:t>3.3</w:t>
       </w:r>
@@ -12405,15 +12673,59 @@
           <w:rFonts w:ascii="Times New Roman" w:hAnsi="Times New Roman" w:cs="Times New Roman"/>
           <w:sz w:val="28"/>
           <w:szCs w:val="28"/>
-        </w:rPr>
-      </w:pPr>
-      <w:r>
-        <w:rPr>
-          <w:rFonts w:ascii="Times New Roman" w:hAnsi="Times New Roman" w:cs="Times New Roman"/>
-          <w:sz w:val="28"/>
-          <w:szCs w:val="28"/>
-        </w:rPr>
-        <w:t>Дан скрипт обмена:</w:t>
+          <w:lang w:val="en-US"/>
+        </w:rPr>
+      </w:pPr>
+      <w:r>
+        <w:rPr>
+          <w:rFonts w:ascii="Times New Roman" w:hAnsi="Times New Roman" w:cs="Times New Roman"/>
+          <w:sz w:val="28"/>
+          <w:szCs w:val="28"/>
+        </w:rPr>
+        <w:t>Дан</w:t>
+      </w:r>
+      <w:r>
+        <w:rPr>
+          <w:rFonts w:ascii="Times New Roman" w:hAnsi="Times New Roman" w:cs="Times New Roman"/>
+          <w:sz w:val="28"/>
+          <w:szCs w:val="28"/>
+          <w:lang w:val="en-US"/>
+        </w:rPr>
+        <w:t xml:space="preserve"> </w:t>
+      </w:r>
+      <w:r>
+        <w:rPr>
+          <w:rFonts w:ascii="Times New Roman" w:hAnsi="Times New Roman" w:cs="Times New Roman"/>
+          <w:sz w:val="28"/>
+          <w:szCs w:val="28"/>
+        </w:rPr>
+        <w:t>скрипт</w:t>
+      </w:r>
+      <w:r>
+        <w:rPr>
+          <w:rFonts w:ascii="Times New Roman" w:hAnsi="Times New Roman" w:cs="Times New Roman"/>
+          <w:sz w:val="28"/>
+          <w:szCs w:val="28"/>
+          <w:lang w:val="en-US"/>
+        </w:rPr>
+        <w:t xml:space="preserve"> </w:t>
+      </w:r>
+      <w:r>
+        <w:rPr>
+          <w:rFonts w:ascii="Times New Roman" w:hAnsi="Times New Roman" w:cs="Times New Roman"/>
+          <w:sz w:val="28"/>
+          <w:szCs w:val="28"/>
+        </w:rPr>
+        <w:t>обмена</w:t>
+      </w:r>
+      <w:r>
+        <w:rPr>
+          <w:rFonts w:ascii="Times New Roman" w:hAnsi="Times New Roman" w:cs="Times New Roman"/>
+          <w:sz w:val="28"/>
+          <w:szCs w:val="28"/>
+          <w:lang w:val="en-US"/>
+        </w:rPr>
+        <w:t>:</w:t>
       </w:r>
     </w:p>
     <w:p>
@@ -12452,15 +12764,40 @@
           <w:rStyle w:val="VerbatimChar"/>
           <w:lang w:val="en-US"/>
         </w:rPr>
-        <w:t>txn_zstd.parquet</w:t>
+        <w:t>txn_</w:t>
+      </w:r>
+      <w:proofErr w:type="gramStart"/>
+      <w:r>
+        <w:rPr>
+          <w:rStyle w:val="VerbatimChar"/>
+          <w:lang w:val="en-US"/>
+        </w:rPr>
+        <w:t>zstd.parquet</w:t>
       </w:r>
       <w:proofErr w:type="spellEnd"/>
+      <w:proofErr w:type="gramEnd"/>
       <w:r>
         <w:rPr>
           <w:rStyle w:val="VerbatimChar"/>
           <w:lang w:val="en-US"/>
         </w:rPr>
-        <w:t xml:space="preserve"> Q="select count(*) from {</w:t>
+        <w:t xml:space="preserve"> Q="select </w:t>
+      </w:r>
+      <w:proofErr w:type="gramStart"/>
+      <w:r>
+        <w:rPr>
+          <w:rStyle w:val="VerbatimChar"/>
+          <w:lang w:val="en-US"/>
+        </w:rPr>
+        <w:t>count(</w:t>
+      </w:r>
+      <w:proofErr w:type="gramEnd"/>
+      <w:r>
+        <w:rPr>
+          <w:rStyle w:val="VerbatimChar"/>
+          <w:lang w:val="en-US"/>
+        </w:rPr>
+        <w:t>*) from {</w:t>
       </w:r>
       <w:proofErr w:type="spellStart"/>
       <w:r>
@@ -12513,9 +12850,18 @@
           <w:rStyle w:val="VerbatimChar"/>
           <w:lang w:val="en-US"/>
         </w:rPr>
-        <w:t>txn_zstd.parquet</w:t>
+        <w:t>txn_</w:t>
+      </w:r>
+      <w:proofErr w:type="gramStart"/>
+      <w:r>
+        <w:rPr>
+          <w:rStyle w:val="VerbatimChar"/>
+          <w:lang w:val="en-US"/>
+        </w:rPr>
+        <w:t>zstd.parquet</w:t>
       </w:r>
       <w:proofErr w:type="spellEnd"/>
+      <w:proofErr w:type="gramEnd"/>
       <w:r>
         <w:rPr>
           <w:rStyle w:val="VerbatimChar"/>
@@ -12534,7 +12880,23 @@
           <w:rStyle w:val="VerbatimChar"/>
           <w:lang w:val="en-US"/>
         </w:rPr>
-        <w:t xml:space="preserve">  Q="select count(*), sum(</w:t>
+        <w:t xml:space="preserve">  Q="select </w:t>
+      </w:r>
+      <w:proofErr w:type="gramStart"/>
+      <w:r>
+        <w:rPr>
+          <w:rStyle w:val="VerbatimChar"/>
+          <w:lang w:val="en-US"/>
+        </w:rPr>
+        <w:t>count(</w:t>
+      </w:r>
+      <w:proofErr w:type="gramEnd"/>
+      <w:r>
+        <w:rPr>
+          <w:rStyle w:val="VerbatimChar"/>
+          <w:lang w:val="en-US"/>
+        </w:rPr>
+        <w:t>*), sum(</w:t>
       </w:r>
       <w:proofErr w:type="spellStart"/>
       <w:r>
@@ -12634,7 +12996,7 @@
                     <pic:cNvPicPr/>
                   </pic:nvPicPr>
                   <pic:blipFill>
-                    <a:blip r:embed="rId26"/>
+                    <a:blip r:embed="rId25"/>
                     <a:stretch>
                       <a:fillRect/>
                     </a:stretch>
@@ -12662,7 +13024,6 @@
           <w:rFonts w:ascii="Times New Roman" w:hAnsi="Times New Roman" w:cs="Times New Roman"/>
           <w:sz w:val="28"/>
           <w:szCs w:val="28"/>
-          <w:lang w:val="en-US"/>
         </w:rPr>
       </w:pPr>
     </w:p>
@@ -12676,21 +13037,11 @@
           <w:lang w:val="en-US"/>
         </w:rPr>
       </w:pPr>
-    </w:p>
-    <w:p>
-      <w:pPr>
-        <w:spacing w:line="240" w:lineRule="auto"/>
-        <w:rPr>
-          <w:rFonts w:ascii="Times New Roman" w:hAnsi="Times New Roman" w:cs="Times New Roman"/>
-          <w:sz w:val="28"/>
-          <w:szCs w:val="28"/>
-          <w:lang w:val="en-US"/>
-        </w:rPr>
-      </w:pPr>
       <w:r>
         <w:rPr>
           <w:noProof/>
         </w:rPr>
+        <w:lastRenderedPageBreak/>
         <w:drawing>
           <wp:inline distT="0" distB="0" distL="0" distR="0" wp14:anchorId="44E4285D" wp14:editId="0BA46C50">
             <wp:extent cx="5940425" cy="847090"/>
@@ -12707,7 +13058,7 @@
                     <pic:cNvPicPr/>
                   </pic:nvPicPr>
                   <pic:blipFill>
-                    <a:blip r:embed="rId27"/>
+                    <a:blip r:embed="rId26"/>
                     <a:stretch>
                       <a:fillRect/>
                     </a:stretch>
@@ -13338,6 +13689,16 @@
         </w:rPr>
         <w:t>, если используется, передаётся отдельно.</w:t>
       </w:r>
+    </w:p>
+    <w:p>
+      <w:pPr>
+        <w:spacing w:line="240" w:lineRule="auto"/>
+        <w:rPr>
+          <w:rFonts w:ascii="Times New Roman" w:hAnsi="Times New Roman" w:cs="Times New Roman"/>
+          <w:sz w:val="28"/>
+          <w:szCs w:val="28"/>
+        </w:rPr>
+      </w:pPr>
     </w:p>
     <w:p>
       <w:pPr>
@@ -13816,6 +14177,7 @@
               </w:rPr>
               <w:t>_</w:t>
             </w:r>
+            <w:proofErr w:type="gramStart"/>
             <w:r>
               <w:rPr>
                 <w:rFonts w:ascii="Times New Roman" w:hAnsi="Times New Roman" w:cs="Times New Roman"/>
@@ -13824,6 +14186,7 @@
               </w:rPr>
               <w:t>zstd.parquet</w:t>
             </w:r>
+            <w:proofErr w:type="gramEnd"/>
           </w:p>
         </w:tc>
         <w:tc>
@@ -14219,6 +14582,7 @@
               </w:rPr>
               <w:t>_</w:t>
             </w:r>
+            <w:proofErr w:type="gramStart"/>
             <w:r>
               <w:rPr>
                 <w:rFonts w:ascii="Times New Roman" w:hAnsi="Times New Roman" w:cs="Times New Roman"/>
@@ -14227,6 +14591,7 @@
               </w:rPr>
               <w:t>zstd.parquet</w:t>
             </w:r>
+            <w:proofErr w:type="gramEnd"/>
           </w:p>
         </w:tc>
         <w:tc>
@@ -14799,7 +15164,7 @@
                     <pic:cNvPicPr/>
                   </pic:nvPicPr>
                   <pic:blipFill>
-                    <a:blip r:embed="rId28"/>
+                    <a:blip r:embed="rId27"/>
                     <a:stretch>
                       <a:fillRect/>
                     </a:stretch>
@@ -15881,7 +16246,7 @@
                     <pic:cNvPicPr/>
                   </pic:nvPicPr>
                   <pic:blipFill>
-                    <a:blip r:embed="rId29"/>
+                    <a:blip r:embed="rId28"/>
                     <a:stretch>
                       <a:fillRect/>
                     </a:stretch>
@@ -15933,7 +16298,7 @@
                     <pic:cNvPicPr/>
                   </pic:nvPicPr>
                   <pic:blipFill>
-                    <a:blip r:embed="rId30"/>
+                    <a:blip r:embed="rId29"/>
                     <a:stretch>
                       <a:fillRect/>
                     </a:stretch>
@@ -16013,7 +16378,7 @@
                     <pic:cNvPicPr/>
                   </pic:nvPicPr>
                   <pic:blipFill>
-                    <a:blip r:embed="rId31"/>
+                    <a:blip r:embed="rId30"/>
                     <a:stretch>
                       <a:fillRect/>
                     </a:stretch>
@@ -16167,7 +16532,7 @@
                     <pic:cNvPicPr/>
                   </pic:nvPicPr>
                   <pic:blipFill>
-                    <a:blip r:embed="rId32"/>
+                    <a:blip r:embed="rId31"/>
                     <a:stretch>
                       <a:fillRect/>
                     </a:stretch>
@@ -16272,7 +16637,7 @@
                     <pic:cNvPicPr/>
                   </pic:nvPicPr>
                   <pic:blipFill>
-                    <a:blip r:embed="rId33"/>
+                    <a:blip r:embed="rId32"/>
                     <a:stretch>
                       <a:fillRect/>
                     </a:stretch>
@@ -16351,6 +16716,7 @@
           <w:lang w:val="en-US"/>
         </w:rPr>
       </w:pPr>
+      <w:proofErr w:type="gramStart"/>
       <w:r>
         <w:rPr>
           <w:rStyle w:val="VerbatimChar"/>
@@ -16367,6 +16733,7 @@
         <w:t>venv</w:t>
       </w:r>
       <w:proofErr w:type="spellEnd"/>
+      <w:proofErr w:type="gramEnd"/>
       <w:r>
         <w:rPr>
           <w:rStyle w:val="VerbatimChar"/>
@@ -16478,7 +16845,7 @@
                     <pic:cNvPicPr/>
                   </pic:nvPicPr>
                   <pic:blipFill>
-                    <a:blip r:embed="rId34"/>
+                    <a:blip r:embed="rId33"/>
                     <a:stretch>
                       <a:fillRect/>
                     </a:stretch>
@@ -16694,15 +17061,25 @@
           <w:rFonts w:ascii="Times New Roman" w:hAnsi="Times New Roman" w:cs="Times New Roman"/>
           <w:sz w:val="28"/>
           <w:szCs w:val="28"/>
-        </w:rPr>
-      </w:pPr>
-      <w:r>
-        <w:rPr>
-          <w:rFonts w:ascii="Times New Roman" w:hAnsi="Times New Roman" w:cs="Times New Roman"/>
-          <w:sz w:val="28"/>
-          <w:szCs w:val="28"/>
-        </w:rPr>
-        <w:t>Чиним видимость создания файлов для читателя. Дописал «</w:t>
+          <w:lang w:val="en-US"/>
+        </w:rPr>
+      </w:pPr>
+      <w:r>
+        <w:rPr>
+          <w:rFonts w:ascii="Times New Roman" w:hAnsi="Times New Roman" w:cs="Times New Roman"/>
+          <w:sz w:val="28"/>
+          <w:szCs w:val="28"/>
+        </w:rPr>
+        <w:t>Чиним видимость создания файлов для читателя. Дописал</w:t>
+      </w:r>
+      <w:r>
+        <w:rPr>
+          <w:rFonts w:ascii="Times New Roman" w:hAnsi="Times New Roman" w:cs="Times New Roman"/>
+          <w:sz w:val="28"/>
+          <w:szCs w:val="28"/>
+          <w:lang w:val="en-US"/>
+        </w:rPr>
+        <w:t xml:space="preserve"> «</w:t>
       </w:r>
       <w:proofErr w:type="spellStart"/>
       <w:r>
@@ -16712,7 +17089,17 @@
           <w:szCs w:val="28"/>
           <w:lang w:val="en-US"/>
         </w:rPr>
-        <w:t>publish_atomic</w:t>
+        <w:t>publish_</w:t>
+      </w:r>
+      <w:proofErr w:type="gramStart"/>
+      <w:r>
+        <w:rPr>
+          <w:rFonts w:ascii="Times New Roman" w:hAnsi="Times New Roman" w:cs="Times New Roman"/>
+          <w:sz w:val="28"/>
+          <w:szCs w:val="28"/>
+          <w:lang w:val="en-US"/>
+        </w:rPr>
+        <w:t>atomic</w:t>
       </w:r>
       <w:proofErr w:type="spellEnd"/>
       <w:r>
@@ -16722,13 +17109,24 @@
           <w:szCs w:val="28"/>
           <w:lang w:val="en-US"/>
         </w:rPr>
-        <w:t>()</w:t>
-      </w:r>
-      <w:r>
-        <w:rPr>
-          <w:rFonts w:ascii="Times New Roman" w:hAnsi="Times New Roman" w:cs="Times New Roman"/>
-          <w:sz w:val="28"/>
-          <w:szCs w:val="28"/>
+        <w:t>(</w:t>
+      </w:r>
+      <w:proofErr w:type="gramEnd"/>
+      <w:r>
+        <w:rPr>
+          <w:rFonts w:ascii="Times New Roman" w:hAnsi="Times New Roman" w:cs="Times New Roman"/>
+          <w:sz w:val="28"/>
+          <w:szCs w:val="28"/>
+          <w:lang w:val="en-US"/>
+        </w:rPr>
+        <w:t>)</w:t>
+      </w:r>
+      <w:r>
+        <w:rPr>
+          <w:rFonts w:ascii="Times New Roman" w:hAnsi="Times New Roman" w:cs="Times New Roman"/>
+          <w:sz w:val="28"/>
+          <w:szCs w:val="28"/>
+          <w:lang w:val="en-US"/>
         </w:rPr>
         <w:t>»:</w:t>
       </w:r>
@@ -16782,7 +17180,20 @@
           <w:lang w:val="en-US" w:eastAsia="ru-RU"/>
           <w14:ligatures w14:val="none"/>
         </w:rPr>
-        <w:t>publish_naive</w:t>
+        <w:t>publish_</w:t>
+      </w:r>
+      <w:proofErr w:type="gramStart"/>
+      <w:r>
+        <w:rPr>
+          <w:rFonts w:ascii="Consolas" w:eastAsia="Times New Roman" w:hAnsi="Consolas" w:cs="Times New Roman"/>
+          <w:color w:val="D2A8FF"/>
+          <w:kern w:val="0"/>
+          <w:sz w:val="21"/>
+          <w:szCs w:val="21"/>
+          <w:lang w:val="en-US" w:eastAsia="ru-RU"/>
+          <w14:ligatures w14:val="none"/>
+        </w:rPr>
+        <w:t>naive</w:t>
       </w:r>
       <w:proofErr w:type="spellEnd"/>
       <w:r>
@@ -16797,6 +17208,7 @@
         </w:rPr>
         <w:t>(</w:t>
       </w:r>
+      <w:proofErr w:type="gramEnd"/>
       <w:r>
         <w:rPr>
           <w:rFonts w:ascii="Consolas" w:eastAsia="Times New Roman" w:hAnsi="Consolas" w:cs="Times New Roman"/>
@@ -17044,7 +17456,20 @@
           <w:lang w:val="en-US" w:eastAsia="ru-RU"/>
           <w14:ligatures w14:val="none"/>
         </w:rPr>
-        <w:t>.put_object</w:t>
+        <w:t>.put_</w:t>
+      </w:r>
+      <w:proofErr w:type="gramStart"/>
+      <w:r>
+        <w:rPr>
+          <w:rFonts w:ascii="Consolas" w:eastAsia="Times New Roman" w:hAnsi="Consolas" w:cs="Times New Roman"/>
+          <w:color w:val="BBBEBF"/>
+          <w:kern w:val="0"/>
+          <w:sz w:val="21"/>
+          <w:szCs w:val="21"/>
+          <w:lang w:val="en-US" w:eastAsia="ru-RU"/>
+          <w14:ligatures w14:val="none"/>
+        </w:rPr>
+        <w:t>object</w:t>
       </w:r>
       <w:proofErr w:type="spellEnd"/>
       <w:r>
@@ -17059,6 +17484,7 @@
         </w:rPr>
         <w:t>(</w:t>
       </w:r>
+      <w:proofErr w:type="gramEnd"/>
       <w:r>
         <w:rPr>
           <w:rFonts w:ascii="Consolas" w:eastAsia="Times New Roman" w:hAnsi="Consolas" w:cs="Times New Roman"/>
@@ -17335,6 +17761,7 @@
         </w:rPr>
         <w:t>=</w:t>
       </w:r>
+      <w:proofErr w:type="gramStart"/>
       <w:r>
         <w:rPr>
           <w:rFonts w:ascii="Consolas" w:eastAsia="Times New Roman" w:hAnsi="Consolas" w:cs="Times New Roman"/>
@@ -17359,6 +17786,7 @@
         </w:rPr>
         <w:t>(</w:t>
       </w:r>
+      <w:proofErr w:type="gramEnd"/>
       <w:r>
         <w:rPr>
           <w:rFonts w:ascii="Consolas" w:eastAsia="Times New Roman" w:hAnsi="Consolas" w:cs="Times New Roman"/>
@@ -17436,6 +17864,7 @@
         </w:rPr>
         <w:t xml:space="preserve">        </w:t>
       </w:r>
+      <w:proofErr w:type="gramStart"/>
       <w:r>
         <w:rPr>
           <w:rFonts w:ascii="Consolas" w:eastAsia="Times New Roman" w:hAnsi="Consolas" w:cs="Times New Roman"/>
@@ -17460,6 +17889,7 @@
         </w:rPr>
         <w:t>(</w:t>
       </w:r>
+      <w:proofErr w:type="gramEnd"/>
       <w:r>
         <w:rPr>
           <w:rFonts w:ascii="Consolas" w:eastAsia="Times New Roman" w:hAnsi="Consolas" w:cs="Times New Roman"/>
@@ -17472,6 +17902,7 @@
         </w:rPr>
         <w:t>f</w:t>
       </w:r>
+      <w:proofErr w:type="gramStart"/>
       <w:r>
         <w:rPr>
           <w:rFonts w:ascii="Consolas" w:eastAsia="Times New Roman" w:hAnsi="Consolas" w:cs="Times New Roman"/>
@@ -17496,6 +17927,7 @@
         </w:rPr>
         <w:t>записан</w:t>
       </w:r>
+      <w:proofErr w:type="gramEnd"/>
       <w:r>
         <w:rPr>
           <w:rFonts w:ascii="Consolas" w:eastAsia="Times New Roman" w:hAnsi="Consolas" w:cs="Times New Roman"/>
@@ -17596,6 +18028,7 @@
         <w:t xml:space="preserve">        </w:t>
       </w:r>
       <w:proofErr w:type="spellStart"/>
+      <w:proofErr w:type="gramStart"/>
       <w:r>
         <w:rPr>
           <w:rFonts w:ascii="Consolas" w:eastAsia="Times New Roman" w:hAnsi="Consolas" w:cs="Times New Roman"/>
@@ -17633,6 +18066,7 @@
         <w:t>sleep</w:t>
       </w:r>
       <w:proofErr w:type="spellEnd"/>
+      <w:proofErr w:type="gramEnd"/>
       <w:r>
         <w:rPr>
           <w:rFonts w:ascii="Consolas" w:eastAsia="Times New Roman" w:hAnsi="Consolas" w:cs="Times New Roman"/>
@@ -17735,7 +18169,20 @@
           <w:lang w:val="en-US" w:eastAsia="ru-RU"/>
           <w14:ligatures w14:val="none"/>
         </w:rPr>
-        <w:t>publish_atomic</w:t>
+        <w:t>publish_</w:t>
+      </w:r>
+      <w:proofErr w:type="gramStart"/>
+      <w:r>
+        <w:rPr>
+          <w:rFonts w:ascii="Consolas" w:eastAsia="Times New Roman" w:hAnsi="Consolas" w:cs="Times New Roman"/>
+          <w:color w:val="D2A8FF"/>
+          <w:kern w:val="0"/>
+          <w:sz w:val="21"/>
+          <w:szCs w:val="21"/>
+          <w:lang w:val="en-US" w:eastAsia="ru-RU"/>
+          <w14:ligatures w14:val="none"/>
+        </w:rPr>
+        <w:t>atomic</w:t>
       </w:r>
       <w:proofErr w:type="spellEnd"/>
       <w:r>
@@ -17750,6 +18197,7 @@
         </w:rPr>
         <w:t>(</w:t>
       </w:r>
+      <w:proofErr w:type="gramEnd"/>
       <w:r>
         <w:rPr>
           <w:rFonts w:ascii="Consolas" w:eastAsia="Times New Roman" w:hAnsi="Consolas" w:cs="Times New Roman"/>
@@ -17967,7 +18415,33 @@
           <w:lang w:eastAsia="ru-RU"/>
           <w14:ligatures w14:val="none"/>
         </w:rPr>
-        <w:t>    например {MART}/_</w:t>
+        <w:t xml:space="preserve">    </w:t>
+      </w:r>
+      <w:proofErr w:type="gramStart"/>
+      <w:r>
+        <w:rPr>
+          <w:rFonts w:ascii="Consolas" w:eastAsia="Times New Roman" w:hAnsi="Consolas" w:cs="Times New Roman"/>
+          <w:color w:val="A5D6FF"/>
+          <w:kern w:val="0"/>
+          <w:sz w:val="21"/>
+          <w:szCs w:val="21"/>
+          <w:lang w:eastAsia="ru-RU"/>
+          <w14:ligatures w14:val="none"/>
+        </w:rPr>
+        <w:t>например</w:t>
+      </w:r>
+      <w:proofErr w:type="gramEnd"/>
+      <w:r>
+        <w:rPr>
+          <w:rFonts w:ascii="Consolas" w:eastAsia="Times New Roman" w:hAnsi="Consolas" w:cs="Times New Roman"/>
+          <w:color w:val="A5D6FF"/>
+          <w:kern w:val="0"/>
+          <w:sz w:val="21"/>
+          <w:szCs w:val="21"/>
+          <w:lang w:eastAsia="ru-RU"/>
+          <w14:ligatures w14:val="none"/>
+        </w:rPr>
+        <w:t xml:space="preserve"> {MART}/_</w:t>
       </w:r>
       <w:proofErr w:type="spellStart"/>
       <w:r>
@@ -18006,7 +18480,20 @@
           <w:lang w:eastAsia="ru-RU"/>
           <w14:ligatures w14:val="none"/>
         </w:rPr>
-        <w:t>read_current</w:t>
+        <w:t>read_</w:t>
+      </w:r>
+      <w:proofErr w:type="gramStart"/>
+      <w:r>
+        <w:rPr>
+          <w:rFonts w:ascii="Consolas" w:eastAsia="Times New Roman" w:hAnsi="Consolas" w:cs="Times New Roman"/>
+          <w:color w:val="A5D6FF"/>
+          <w:kern w:val="0"/>
+          <w:sz w:val="21"/>
+          <w:szCs w:val="21"/>
+          <w:lang w:eastAsia="ru-RU"/>
+          <w14:ligatures w14:val="none"/>
+        </w:rPr>
+        <w:t>current</w:t>
       </w:r>
       <w:proofErr w:type="spellEnd"/>
       <w:r>
@@ -18019,7 +18506,20 @@
           <w:lang w:eastAsia="ru-RU"/>
           <w14:ligatures w14:val="none"/>
         </w:rPr>
-        <w:t>() в reader.py."""</w:t>
+        <w:t>(</w:t>
+      </w:r>
+      <w:proofErr w:type="gramEnd"/>
+      <w:r>
+        <w:rPr>
+          <w:rFonts w:ascii="Consolas" w:eastAsia="Times New Roman" w:hAnsi="Consolas" w:cs="Times New Roman"/>
+          <w:color w:val="A5D6FF"/>
+          <w:kern w:val="0"/>
+          <w:sz w:val="21"/>
+          <w:szCs w:val="21"/>
+          <w:lang w:eastAsia="ru-RU"/>
+          <w14:ligatures w14:val="none"/>
+        </w:rPr>
+        <w:t>) в reader.py."""</w:t>
       </w:r>
     </w:p>
     <w:p>
@@ -18049,6 +18549,7 @@
         <w:t xml:space="preserve">    </w:t>
       </w:r>
       <w:proofErr w:type="spellStart"/>
+      <w:proofErr w:type="gramStart"/>
       <w:r>
         <w:rPr>
           <w:rFonts w:ascii="Consolas" w:eastAsia="Times New Roman" w:hAnsi="Consolas" w:cs="Times New Roman"/>
@@ -18075,6 +18576,7 @@
         <w:t>(</w:t>
       </w:r>
       <w:proofErr w:type="spellStart"/>
+      <w:proofErr w:type="gramEnd"/>
       <w:r>
         <w:rPr>
           <w:rFonts w:ascii="Consolas" w:eastAsia="Times New Roman" w:hAnsi="Consolas" w:cs="Times New Roman"/>
@@ -18278,6 +18780,7 @@
         </w:rPr>
         <w:t xml:space="preserve">    </w:t>
       </w:r>
+      <w:proofErr w:type="gramStart"/>
       <w:r>
         <w:rPr>
           <w:rFonts w:ascii="Consolas" w:eastAsia="Times New Roman" w:hAnsi="Consolas" w:cs="Times New Roman"/>
@@ -18302,6 +18805,7 @@
         </w:rPr>
         <w:t>(</w:t>
       </w:r>
+      <w:proofErr w:type="gramEnd"/>
       <w:r>
         <w:rPr>
           <w:rFonts w:ascii="Consolas" w:eastAsia="Times New Roman" w:hAnsi="Consolas" w:cs="Times New Roman"/>
@@ -18484,7 +18988,20 @@
           <w:lang w:val="en-US" w:eastAsia="ru-RU"/>
           <w14:ligatures w14:val="none"/>
         </w:rPr>
-        <w:t>.put_object</w:t>
+        <w:t>.put_</w:t>
+      </w:r>
+      <w:proofErr w:type="gramStart"/>
+      <w:r>
+        <w:rPr>
+          <w:rFonts w:ascii="Consolas" w:eastAsia="Times New Roman" w:hAnsi="Consolas" w:cs="Times New Roman"/>
+          <w:color w:val="BBBEBF"/>
+          <w:kern w:val="0"/>
+          <w:sz w:val="21"/>
+          <w:szCs w:val="21"/>
+          <w:lang w:val="en-US" w:eastAsia="ru-RU"/>
+          <w14:ligatures w14:val="none"/>
+        </w:rPr>
+        <w:t>object</w:t>
       </w:r>
       <w:proofErr w:type="spellEnd"/>
       <w:r>
@@ -18499,6 +19016,7 @@
         </w:rPr>
         <w:t>(</w:t>
       </w:r>
+      <w:proofErr w:type="gramEnd"/>
       <w:r>
         <w:rPr>
           <w:rFonts w:ascii="Consolas" w:eastAsia="Times New Roman" w:hAnsi="Consolas" w:cs="Times New Roman"/>
@@ -18781,6 +19299,7 @@
         <w:t xml:space="preserve">    </w:t>
       </w:r>
       <w:proofErr w:type="spellStart"/>
+      <w:proofErr w:type="gramStart"/>
       <w:r>
         <w:rPr>
           <w:rFonts w:ascii="Consolas" w:eastAsia="Times New Roman" w:hAnsi="Consolas" w:cs="Times New Roman"/>
@@ -18807,6 +19326,7 @@
         <w:t>(</w:t>
       </w:r>
       <w:proofErr w:type="spellStart"/>
+      <w:proofErr w:type="gramEnd"/>
       <w:r>
         <w:rPr>
           <w:rFonts w:ascii="Consolas" w:eastAsia="Times New Roman" w:hAnsi="Consolas" w:cs="Times New Roman"/>
@@ -18952,7 +19472,17 @@
           <w:szCs w:val="28"/>
           <w:lang w:val="en-US"/>
         </w:rPr>
-        <w:t>read_current</w:t>
+        <w:t>read_</w:t>
+      </w:r>
+      <w:proofErr w:type="gramStart"/>
+      <w:r>
+        <w:rPr>
+          <w:rFonts w:ascii="Times New Roman" w:hAnsi="Times New Roman" w:cs="Times New Roman"/>
+          <w:sz w:val="28"/>
+          <w:szCs w:val="28"/>
+          <w:lang w:val="en-US"/>
+        </w:rPr>
+        <w:t>current</w:t>
       </w:r>
       <w:proofErr w:type="spellEnd"/>
       <w:r>
@@ -18962,7 +19492,17 @@
           <w:szCs w:val="28"/>
           <w:lang w:val="en-US"/>
         </w:rPr>
-        <w:t>()</w:t>
+        <w:t>(</w:t>
+      </w:r>
+      <w:proofErr w:type="gramEnd"/>
+      <w:r>
+        <w:rPr>
+          <w:rFonts w:ascii="Times New Roman" w:hAnsi="Times New Roman" w:cs="Times New Roman"/>
+          <w:sz w:val="28"/>
+          <w:szCs w:val="28"/>
+          <w:lang w:val="en-US"/>
+        </w:rPr>
+        <w:t>)</w:t>
       </w:r>
       <w:r>
         <w:rPr>
@@ -19032,7 +19572,20 @@
           <w:lang w:val="en-US" w:eastAsia="ru-RU"/>
           <w14:ligatures w14:val="none"/>
         </w:rPr>
-        <w:t>read_current</w:t>
+        <w:t>read_</w:t>
+      </w:r>
+      <w:proofErr w:type="gramStart"/>
+      <w:r>
+        <w:rPr>
+          <w:rFonts w:ascii="Consolas" w:eastAsia="Times New Roman" w:hAnsi="Consolas" w:cs="Times New Roman"/>
+          <w:color w:val="D2A8FF"/>
+          <w:kern w:val="0"/>
+          <w:sz w:val="21"/>
+          <w:szCs w:val="21"/>
+          <w:lang w:val="en-US" w:eastAsia="ru-RU"/>
+          <w14:ligatures w14:val="none"/>
+        </w:rPr>
+        <w:t>current</w:t>
       </w:r>
       <w:proofErr w:type="spellEnd"/>
       <w:r>
@@ -19045,7 +19598,20 @@
           <w:lang w:val="en-US" w:eastAsia="ru-RU"/>
           <w14:ligatures w14:val="none"/>
         </w:rPr>
-        <w:t>():</w:t>
+        <w:t>(</w:t>
+      </w:r>
+      <w:proofErr w:type="gramEnd"/>
+      <w:r>
+        <w:rPr>
+          <w:rFonts w:ascii="Consolas" w:eastAsia="Times New Roman" w:hAnsi="Consolas" w:cs="Times New Roman"/>
+          <w:color w:val="BBBEBF"/>
+          <w:kern w:val="0"/>
+          <w:sz w:val="21"/>
+          <w:szCs w:val="21"/>
+          <w:lang w:val="en-US" w:eastAsia="ru-RU"/>
+          <w14:ligatures w14:val="none"/>
+        </w:rPr>
+        <w:t>):</w:t>
       </w:r>
     </w:p>
     <w:p>
@@ -19312,7 +19878,20 @@
           <w:lang w:val="en-US" w:eastAsia="ru-RU"/>
           <w14:ligatures w14:val="none"/>
         </w:rPr>
-        <w:t>.get_object</w:t>
+        <w:t>.get_</w:t>
+      </w:r>
+      <w:proofErr w:type="gramStart"/>
+      <w:r>
+        <w:rPr>
+          <w:rFonts w:ascii="Consolas" w:eastAsia="Times New Roman" w:hAnsi="Consolas" w:cs="Times New Roman"/>
+          <w:color w:val="BBBEBF"/>
+          <w:kern w:val="0"/>
+          <w:sz w:val="21"/>
+          <w:szCs w:val="21"/>
+          <w:lang w:val="en-US" w:eastAsia="ru-RU"/>
+          <w14:ligatures w14:val="none"/>
+        </w:rPr>
+        <w:t>object</w:t>
       </w:r>
       <w:proofErr w:type="spellEnd"/>
       <w:r>
@@ -19327,6 +19906,7 @@
         </w:rPr>
         <w:t>(</w:t>
       </w:r>
+      <w:proofErr w:type="gramEnd"/>
       <w:r>
         <w:rPr>
           <w:rFonts w:ascii="Consolas" w:eastAsia="Times New Roman" w:hAnsi="Consolas" w:cs="Times New Roman"/>
@@ -19570,17 +20150,57 @@
         </w:rPr>
         <w:t>"Body"</w:t>
       </w:r>
-      <w:r>
-        <w:rPr>
-          <w:rFonts w:ascii="Consolas" w:eastAsia="Times New Roman" w:hAnsi="Consolas" w:cs="Times New Roman"/>
-          <w:color w:val="BBBEBF"/>
-          <w:kern w:val="0"/>
-          <w:sz w:val="21"/>
-          <w:szCs w:val="21"/>
-          <w:lang w:val="en-US" w:eastAsia="ru-RU"/>
-          <w14:ligatures w14:val="none"/>
-        </w:rPr>
-        <w:t>].read().decode(</w:t>
+      <w:proofErr w:type="gramStart"/>
+      <w:r>
+        <w:rPr>
+          <w:rFonts w:ascii="Consolas" w:eastAsia="Times New Roman" w:hAnsi="Consolas" w:cs="Times New Roman"/>
+          <w:color w:val="BBBEBF"/>
+          <w:kern w:val="0"/>
+          <w:sz w:val="21"/>
+          <w:szCs w:val="21"/>
+          <w:lang w:val="en-US" w:eastAsia="ru-RU"/>
+          <w14:ligatures w14:val="none"/>
+        </w:rPr>
+        <w:t>].read</w:t>
+      </w:r>
+      <w:proofErr w:type="gramEnd"/>
+      <w:r>
+        <w:rPr>
+          <w:rFonts w:ascii="Consolas" w:eastAsia="Times New Roman" w:hAnsi="Consolas" w:cs="Times New Roman"/>
+          <w:color w:val="BBBEBF"/>
+          <w:kern w:val="0"/>
+          <w:sz w:val="21"/>
+          <w:szCs w:val="21"/>
+          <w:lang w:val="en-US" w:eastAsia="ru-RU"/>
+          <w14:ligatures w14:val="none"/>
+        </w:rPr>
+        <w:t>(</w:t>
+      </w:r>
+      <w:proofErr w:type="gramStart"/>
+      <w:r>
+        <w:rPr>
+          <w:rFonts w:ascii="Consolas" w:eastAsia="Times New Roman" w:hAnsi="Consolas" w:cs="Times New Roman"/>
+          <w:color w:val="BBBEBF"/>
+          <w:kern w:val="0"/>
+          <w:sz w:val="21"/>
+          <w:szCs w:val="21"/>
+          <w:lang w:val="en-US" w:eastAsia="ru-RU"/>
+          <w14:ligatures w14:val="none"/>
+        </w:rPr>
+        <w:t>).decode</w:t>
+      </w:r>
+      <w:proofErr w:type="gramEnd"/>
+      <w:r>
+        <w:rPr>
+          <w:rFonts w:ascii="Consolas" w:eastAsia="Times New Roman" w:hAnsi="Consolas" w:cs="Times New Roman"/>
+          <w:color w:val="BBBEBF"/>
+          <w:kern w:val="0"/>
+          <w:sz w:val="21"/>
+          <w:szCs w:val="21"/>
+          <w:lang w:val="en-US" w:eastAsia="ru-RU"/>
+          <w14:ligatures w14:val="none"/>
+        </w:rPr>
+        <w:t>(</w:t>
       </w:r>
       <w:r>
         <w:rPr>
@@ -19594,17 +20214,31 @@
         </w:rPr>
         <w:t>"utf-8"</w:t>
       </w:r>
-      <w:r>
-        <w:rPr>
-          <w:rFonts w:ascii="Consolas" w:eastAsia="Times New Roman" w:hAnsi="Consolas" w:cs="Times New Roman"/>
-          <w:color w:val="BBBEBF"/>
-          <w:kern w:val="0"/>
-          <w:sz w:val="21"/>
-          <w:szCs w:val="21"/>
-          <w:lang w:val="en-US" w:eastAsia="ru-RU"/>
-          <w14:ligatures w14:val="none"/>
-        </w:rPr>
-        <w:t>).strip()</w:t>
+      <w:proofErr w:type="gramStart"/>
+      <w:r>
+        <w:rPr>
+          <w:rFonts w:ascii="Consolas" w:eastAsia="Times New Roman" w:hAnsi="Consolas" w:cs="Times New Roman"/>
+          <w:color w:val="BBBEBF"/>
+          <w:kern w:val="0"/>
+          <w:sz w:val="21"/>
+          <w:szCs w:val="21"/>
+          <w:lang w:val="en-US" w:eastAsia="ru-RU"/>
+          <w14:ligatures w14:val="none"/>
+        </w:rPr>
+        <w:t>).strip</w:t>
+      </w:r>
+      <w:proofErr w:type="gramEnd"/>
+      <w:r>
+        <w:rPr>
+          <w:rFonts w:ascii="Consolas" w:eastAsia="Times New Roman" w:hAnsi="Consolas" w:cs="Times New Roman"/>
+          <w:color w:val="BBBEBF"/>
+          <w:kern w:val="0"/>
+          <w:sz w:val="21"/>
+          <w:szCs w:val="21"/>
+          <w:lang w:val="en-US" w:eastAsia="ru-RU"/>
+          <w14:ligatures w14:val="none"/>
+        </w:rPr>
+        <w:t>()</w:t>
       </w:r>
     </w:p>
     <w:p>
@@ -19783,6 +20417,7 @@
         <w:t xml:space="preserve"> </w:t>
       </w:r>
       <w:proofErr w:type="spellStart"/>
+      <w:proofErr w:type="gramStart"/>
       <w:r>
         <w:rPr>
           <w:rFonts w:ascii="Consolas" w:eastAsia="Times New Roman" w:hAnsi="Consolas" w:cs="Times New Roman"/>
@@ -19808,6 +20443,7 @@
         <w:t>.response</w:t>
       </w:r>
       <w:proofErr w:type="spellEnd"/>
+      <w:proofErr w:type="gramEnd"/>
       <w:r>
         <w:rPr>
           <w:rFonts w:ascii="Consolas" w:eastAsia="Times New Roman" w:hAnsi="Consolas" w:cs="Times New Roman"/>
@@ -19830,7 +20466,20 @@
           <w:lang w:val="en-US" w:eastAsia="ru-RU"/>
           <w14:ligatures w14:val="none"/>
         </w:rPr>
-        <w:t>"Error"</w:t>
+        <w:t>"Error</w:t>
+      </w:r>
+      <w:proofErr w:type="gramStart"/>
+      <w:r>
+        <w:rPr>
+          <w:rFonts w:ascii="Consolas" w:eastAsia="Times New Roman" w:hAnsi="Consolas" w:cs="Times New Roman"/>
+          <w:color w:val="A5D6FF"/>
+          <w:kern w:val="0"/>
+          <w:sz w:val="21"/>
+          <w:szCs w:val="21"/>
+          <w:lang w:val="en-US" w:eastAsia="ru-RU"/>
+          <w14:ligatures w14:val="none"/>
+        </w:rPr>
+        <w:t>"</w:t>
       </w:r>
       <w:r>
         <w:rPr>
@@ -19844,6 +20493,7 @@
         </w:rPr>
         <w:t>][</w:t>
       </w:r>
+      <w:proofErr w:type="gramEnd"/>
       <w:r>
         <w:rPr>
           <w:rFonts w:ascii="Consolas" w:eastAsia="Times New Roman" w:hAnsi="Consolas" w:cs="Times New Roman"/>
@@ -20105,9 +20755,36 @@
           <w:lang w:val="en-US" w:eastAsia="ru-RU"/>
           <w14:ligatures w14:val="none"/>
         </w:rPr>
-        <w:t xml:space="preserve"># raise </w:t>
+        <w:t xml:space="preserve"># </w:t>
+      </w:r>
+      <w:proofErr w:type="gramStart"/>
+      <w:r>
+        <w:rPr>
+          <w:rFonts w:ascii="Consolas" w:eastAsia="Times New Roman" w:hAnsi="Consolas" w:cs="Times New Roman"/>
+          <w:color w:val="8B949E"/>
+          <w:kern w:val="0"/>
+          <w:sz w:val="21"/>
+          <w:szCs w:val="21"/>
+          <w:lang w:val="en-US" w:eastAsia="ru-RU"/>
+          <w14:ligatures w14:val="none"/>
+        </w:rPr>
+        <w:t>raise</w:t>
+      </w:r>
+      <w:proofErr w:type="gramEnd"/>
+      <w:r>
+        <w:rPr>
+          <w:rFonts w:ascii="Consolas" w:eastAsia="Times New Roman" w:hAnsi="Consolas" w:cs="Times New Roman"/>
+          <w:color w:val="8B949E"/>
+          <w:kern w:val="0"/>
+          <w:sz w:val="21"/>
+          <w:szCs w:val="21"/>
+          <w:lang w:val="en-US" w:eastAsia="ru-RU"/>
+          <w14:ligatures w14:val="none"/>
+        </w:rPr>
+        <w:t xml:space="preserve"> </w:t>
       </w:r>
       <w:proofErr w:type="spellStart"/>
+      <w:proofErr w:type="gramStart"/>
       <w:r>
         <w:rPr>
           <w:rFonts w:ascii="Consolas" w:eastAsia="Times New Roman" w:hAnsi="Consolas" w:cs="Times New Roman"/>
@@ -20131,7 +20808,20 @@
           <w:lang w:val="en-US" w:eastAsia="ru-RU"/>
           <w14:ligatures w14:val="none"/>
         </w:rPr>
-        <w:t>("</w:t>
+        <w:t>(</w:t>
+      </w:r>
+      <w:proofErr w:type="gramEnd"/>
+      <w:r>
+        <w:rPr>
+          <w:rFonts w:ascii="Consolas" w:eastAsia="Times New Roman" w:hAnsi="Consolas" w:cs="Times New Roman"/>
+          <w:color w:val="8B949E"/>
+          <w:kern w:val="0"/>
+          <w:sz w:val="21"/>
+          <w:szCs w:val="21"/>
+          <w:lang w:val="en-US" w:eastAsia="ru-RU"/>
+          <w14:ligatures w14:val="none"/>
+        </w:rPr>
+        <w:t>"</w:t>
       </w:r>
       <w:r>
         <w:rPr>
@@ -20191,6 +20881,7 @@
           <w:rFonts w:ascii="Times New Roman" w:hAnsi="Times New Roman" w:cs="Times New Roman"/>
           <w:sz w:val="28"/>
           <w:szCs w:val="28"/>
+          <w:lang w:val="en-US"/>
         </w:rPr>
       </w:pPr>
     </w:p>
@@ -20241,7 +20932,7 @@
                     <pic:cNvPicPr/>
                   </pic:nvPicPr>
                   <pic:blipFill>
-                    <a:blip r:embed="rId35"/>
+                    <a:blip r:embed="rId34"/>
                     <a:stretch>
                       <a:fillRect/>
                     </a:stretch>
@@ -21241,6 +21932,14 @@
               </w:rPr>
               <w:t>HDFS</w:t>
             </w:r>
+            <w:r>
+              <w:rPr>
+                <w:rFonts w:ascii="Times New Roman" w:hAnsi="Times New Roman" w:cs="Times New Roman"/>
+                <w:sz w:val="22"/>
+                <w:szCs w:val="22"/>
+              </w:rPr>
+              <w:t xml:space="preserve"> (Изменить способ записи)</w:t>
+            </w:r>
           </w:p>
         </w:tc>
         <w:tc>
@@ -21510,7 +22209,25 @@
                 <w:sz w:val="22"/>
                 <w:szCs w:val="22"/>
               </w:rPr>
-              <w:t xml:space="preserve">за О(1). В </w:t>
+              <w:t xml:space="preserve">за </w:t>
+            </w:r>
+            <w:proofErr w:type="gramStart"/>
+            <w:r>
+              <w:rPr>
+                <w:rFonts w:ascii="Times New Roman" w:hAnsi="Times New Roman" w:cs="Times New Roman"/>
+                <w:sz w:val="22"/>
+                <w:szCs w:val="22"/>
+              </w:rPr>
+              <w:t>О(</w:t>
+            </w:r>
+            <w:proofErr w:type="gramEnd"/>
+            <w:r>
+              <w:rPr>
+                <w:rFonts w:ascii="Times New Roman" w:hAnsi="Times New Roman" w:cs="Times New Roman"/>
+                <w:sz w:val="22"/>
+                <w:szCs w:val="22"/>
+              </w:rPr>
+              <w:t xml:space="preserve">1). В </w:t>
             </w:r>
             <w:r>
               <w:rPr>
@@ -21535,7 +22252,7 @@
                 <w:sz w:val="22"/>
                 <w:szCs w:val="22"/>
               </w:rPr>
-              <w:t xml:space="preserve"> файлы имм</w:t>
+              <w:t xml:space="preserve"> файлы </w:t>
             </w:r>
             <w:proofErr w:type="spellStart"/>
             <w:r>
@@ -21544,7 +22261,7 @@
                 <w:sz w:val="22"/>
                 <w:szCs w:val="22"/>
               </w:rPr>
-              <w:t>утабельны</w:t>
+              <w:t>иммутабельны</w:t>
             </w:r>
             <w:proofErr w:type="spellEnd"/>
             <w:r>
@@ -21694,7 +22411,7 @@
                     <pic:cNvPicPr/>
                   </pic:nvPicPr>
                   <pic:blipFill>
-                    <a:blip r:embed="rId36"/>
+                    <a:blip r:embed="rId35"/>
                     <a:stretch>
                       <a:fillRect/>
                     </a:stretch>
@@ -21773,7 +22490,7 @@
                     <pic:cNvPicPr/>
                   </pic:nvPicPr>
                   <pic:blipFill>
-                    <a:blip r:embed="rId37"/>
+                    <a:blip r:embed="rId36"/>
                     <a:stretch>
                       <a:fillRect/>
                     </a:stretch>

</xml_diff>